<commit_message>
fix(generation): fix output formatting and content
</commit_message>
<xml_diff>
--- a/output_cv.docx
+++ b/output_cv.docx
@@ -24,23 +24,60 @@
       <w:r>
         <w:rPr>
           <w:rFonts w:ascii="Times New Roman" w:hAnsi="Times New Roman"/>
-          <w:sz w:val="20"/>
+          <w:sz w:val="21"/>
         </w:rPr>
-        <w:t>+20 1156637443 | moaaz.emam06@eng-st.cu.edu.eg | www.linkedin.com/in/moaaz-emam-8206cai</w:t>
+        <w:t>+20 1156637443</w:t>
       </w:r>
+      <w:r>
+        <w:rPr>
+          <w:rFonts w:ascii="Times New Roman" w:hAnsi="Times New Roman"/>
+          <w:sz w:val="21"/>
+        </w:rPr>
+        <w:t xml:space="preserve"> | </w:t>
+      </w:r>
+      <w:hyperlink r:id="rId9">
+        <w:r>
+          <w:rPr>
+            <w:u w:val="single"/>
+            <w:rFonts w:ascii="Times New Roman" w:hAnsi="Times New Roman"/>
+            <w:sz w:val="21"/>
+          </w:rPr>
+          <w:t>moaaz.emam06@eng-st.cu.edu.eg</w:t>
+        </w:r>
+      </w:hyperlink>
+      <w:r>
+        <w:rPr>
+          <w:rFonts w:ascii="Times New Roman" w:hAnsi="Times New Roman"/>
+          <w:sz w:val="21"/>
+        </w:rPr>
+        <w:t xml:space="preserve"> | </w:t>
+      </w:r>
+      <w:hyperlink r:id="rId10">
+        <w:r>
+          <w:rPr>
+            <w:u w:val="single"/>
+            <w:rFonts w:ascii="Times New Roman" w:hAnsi="Times New Roman"/>
+            <w:sz w:val="21"/>
+          </w:rPr>
+          <w:t>www.linkedin.com/in/moaaz-emam-8206cai</w:t>
+        </w:r>
+      </w:hyperlink>
     </w:p>
     <w:p>
       <w:pPr>
         <w:spacing w:after="80"/>
         <w:jc w:val="center"/>
       </w:pPr>
-      <w:r>
-        <w:rPr>
-          <w:rFonts w:ascii="Times New Roman" w:hAnsi="Times New Roman"/>
-          <w:sz w:val="20"/>
-        </w:rPr>
-        <w:t>https://github.com/MoaazEmam</w:t>
-      </w:r>
+      <w:hyperlink r:id="rId11">
+        <w:r>
+          <w:rPr>
+            <w:u w:val="single"/>
+            <w:rFonts w:ascii="Times New Roman" w:hAnsi="Times New Roman"/>
+            <w:sz w:val="21"/>
+          </w:rPr>
+          <w:t>https://github.com/MoaazEmam</w:t>
+        </w:r>
+      </w:hyperlink>
     </w:p>
     <w:p>
       <w:pPr>
@@ -53,7 +90,7 @@
         <w:rPr>
           <w:rFonts w:ascii="Times New Roman" w:hAnsi="Times New Roman"/>
           <w:b w:val="0"/>
-          <w:sz w:val="22"/>
+          <w:sz w:val="21"/>
         </w:rPr>
         <w:t>EDUCATION</w:t>
       </w:r>
@@ -62,22 +99,22 @@
       <w:pPr>
         <w:spacing w:after="20"/>
         <w:tabs>
-          <w:tab w:val="right" w:pos="9360"/>
+          <w:tab w:val="right" w:pos="11520"/>
         </w:tabs>
       </w:pPr>
       <w:r>
         <w:rPr>
           <w:rFonts w:ascii="Times New Roman" w:hAnsi="Times New Roman"/>
           <w:b/>
-          <w:sz w:val="20"/>
+          <w:sz w:val="21"/>
         </w:rPr>
-        <w:t>Cairo University ||GPA: 3.58</w:t>
+        <w:t>Cairo University ||Faculty of Engineering ||GPA: 3.58</w:t>
       </w:r>
       <w:r>
         <w:rPr>
           <w:rFonts w:ascii="Times New Roman" w:hAnsi="Times New Roman"/>
-          <w:b/>
-          <w:sz w:val="20"/>
+          <w:b w:val="0"/>
+          <w:sz w:val="21"/>
         </w:rPr>
         <w:tab/>
         <w:t>2022 – 2027</w:t>
@@ -91,7 +128,7 @@
         <w:rPr>
           <w:rFonts w:ascii="Times New Roman" w:hAnsi="Times New Roman"/>
           <w:i/>
-          <w:sz w:val="20"/>
+          <w:sz w:val="21"/>
         </w:rPr>
         <w:t>Major: Communication and Computer Engineering</w:t>
       </w:r>
@@ -107,7 +144,7 @@
         <w:rPr>
           <w:rFonts w:ascii="Times New Roman" w:hAnsi="Times New Roman"/>
           <w:b w:val="0"/>
-          <w:sz w:val="22"/>
+          <w:sz w:val="21"/>
         </w:rPr>
         <w:t>SKILLS</w:t>
       </w:r>
@@ -121,7 +158,7 @@
         <w:rPr>
           <w:rFonts w:ascii="Times New Roman" w:hAnsi="Times New Roman"/>
           <w:b/>
-          <w:sz w:val="20"/>
+          <w:sz w:val="21"/>
         </w:rPr>
         <w:t xml:space="preserve">Programming Languages: </w:t>
       </w:r>
@@ -129,7 +166,7 @@
         <w:rPr>
           <w:rFonts w:ascii="Times New Roman" w:hAnsi="Times New Roman"/>
           <w:b w:val="0"/>
-          <w:sz w:val="20"/>
+          <w:sz w:val="21"/>
         </w:rPr>
         <w:t>C++, C, C#, Python, JavaScript, SQL, ARM assembly, Verilog HDL, Java</w:t>
       </w:r>
@@ -143,7 +180,7 @@
         <w:rPr>
           <w:rFonts w:ascii="Times New Roman" w:hAnsi="Times New Roman"/>
           <w:b/>
-          <w:sz w:val="20"/>
+          <w:sz w:val="21"/>
         </w:rPr>
         <w:t xml:space="preserve">Development Tools &amp; Environments: </w:t>
       </w:r>
@@ -151,7 +188,7 @@
         <w:rPr>
           <w:rFonts w:ascii="Times New Roman" w:hAnsi="Times New Roman"/>
           <w:b w:val="0"/>
-          <w:sz w:val="20"/>
+          <w:sz w:val="21"/>
         </w:rPr>
         <w:t>Git, GitHub, Linux, Visual studio, IntelliJ IDEA, SQL Server, MongoDB, NodeJS, Postman, .NET framework, ModelSim, Logisim, Apache Airflow, Docker, Scrapy, Playwright, n8n, Airtable</w:t>
       </w:r>
@@ -165,7 +202,7 @@
         <w:rPr>
           <w:rFonts w:ascii="Times New Roman" w:hAnsi="Times New Roman"/>
           <w:b/>
-          <w:sz w:val="20"/>
+          <w:sz w:val="21"/>
         </w:rPr>
         <w:t xml:space="preserve">Soft Skills: </w:t>
       </w:r>
@@ -173,9 +210,49 @@
         <w:rPr>
           <w:rFonts w:ascii="Times New Roman" w:hAnsi="Times New Roman"/>
           <w:b w:val="0"/>
-          <w:sz w:val="20"/>
+          <w:sz w:val="21"/>
         </w:rPr>
         <w:t>Problem solving, Team collaboration, Rapid adaptability and learning, Effective communication</w:t>
+      </w:r>
+    </w:p>
+    <w:p>
+      <w:pPr>
+        <w:pStyle w:val="ListBullet"/>
+        <w:spacing w:after="20"/>
+      </w:pPr>
+      <w:r>
+        <w:rPr>
+          <w:rFonts w:ascii="Times New Roman" w:hAnsi="Times New Roman"/>
+          <w:b/>
+          <w:sz w:val="21"/>
+        </w:rPr>
+        <w:t>Certifications &amp; Courses:</w:t>
+      </w:r>
+    </w:p>
+    <w:p>
+      <w:pPr>
+        <w:pStyle w:val="ListBullet2"/>
+        <w:spacing w:after="20"/>
+      </w:pPr>
+      <w:r>
+        <w:rPr>
+          <w:rFonts w:ascii="Times New Roman" w:hAnsi="Times New Roman"/>
+          <w:sz w:val="21"/>
+        </w:rPr>
+        <w:t>Backend Development Certificate – IEEE</w:t>
+      </w:r>
+    </w:p>
+    <w:p>
+      <w:pPr>
+        <w:pStyle w:val="ListBullet2"/>
+        <w:spacing w:after="20"/>
+      </w:pPr>
+      <w:r>
+        <w:rPr>
+          <w:rFonts w:ascii="Times New Roman" w:hAnsi="Times New Roman"/>
+          <w:sz w:val="21"/>
+        </w:rPr>
+        <w:t>AI Certificate – IEEE</w:t>
       </w:r>
     </w:p>
     <w:p>
@@ -189,23 +266,23 @@
         <w:rPr>
           <w:rFonts w:ascii="Times New Roman" w:hAnsi="Times New Roman"/>
           <w:b w:val="0"/>
-          <w:sz w:val="22"/>
+          <w:sz w:val="21"/>
         </w:rPr>
-        <w:t>EXPERIENCE AND PROJECTS</w:t>
+        <w:t>EXPERIENCE</w:t>
       </w:r>
     </w:p>
     <w:p>
       <w:pPr>
         <w:spacing w:after="40"/>
         <w:tabs>
-          <w:tab w:val="right" w:pos="9360"/>
+          <w:tab w:val="right" w:pos="11520"/>
         </w:tabs>
       </w:pPr>
       <w:r>
         <w:rPr>
           <w:rFonts w:ascii="Times New Roman" w:hAnsi="Times New Roman"/>
           <w:b/>
-          <w:sz w:val="20"/>
+          <w:sz w:val="21"/>
         </w:rPr>
         <w:t>Data Engineering Intern:</w:t>
       </w:r>
@@ -213,14 +290,14 @@
         <w:rPr>
           <w:rFonts w:ascii="Times New Roman" w:hAnsi="Times New Roman"/>
           <w:i/>
-          <w:sz w:val="20"/>
+          <w:sz w:val="21"/>
         </w:rPr>
         <w:t xml:space="preserve"> Instacodigo (Remote)</w:t>
       </w:r>
       <w:r>
         <w:rPr>
           <w:rFonts w:ascii="Times New Roman" w:hAnsi="Times New Roman"/>
-          <w:sz w:val="20"/>
+          <w:sz w:val="21"/>
         </w:rPr>
         <w:tab/>
         <w:t>Jul 2025 – Oct 2025</w:t>
@@ -234,7 +311,7 @@
       <w:r>
         <w:rPr>
           <w:rFonts w:ascii="Times New Roman" w:hAnsi="Times New Roman"/>
-          <w:sz w:val="20"/>
+          <w:sz w:val="21"/>
         </w:rPr>
         <w:t>Designed and implemented an automated data pipeline using Apache Airflow for large-scale web data collection, processing, validation, and integration with Odoo ERP.</w:t>
       </w:r>
@@ -247,7 +324,7 @@
       <w:r>
         <w:rPr>
           <w:rFonts w:ascii="Times New Roman" w:hAnsi="Times New Roman"/>
-          <w:sz w:val="20"/>
+          <w:sz w:val="21"/>
         </w:rPr>
         <w:t>Built a modular scraping framework using Scrapy and Playwright to extract structured data from static and JavaScript-rendered websites at scale.</w:t>
       </w:r>
@@ -260,7 +337,7 @@
       <w:r>
         <w:rPr>
           <w:rFonts w:ascii="Times New Roman" w:hAnsi="Times New Roman"/>
-          <w:sz w:val="20"/>
+          <w:sz w:val="21"/>
         </w:rPr>
         <w:t>Implemented data cleaning, deduplication, serialization, and schema enforcement using Pydantic, with branching DAG workflows routing products, jobs, and articles to appropriate Odoo models via OdooRPC.</w:t>
       </w:r>
@@ -273,38 +350,109 @@
       <w:r>
         <w:rPr>
           <w:rFonts w:ascii="Times New Roman" w:hAnsi="Times New Roman"/>
-          <w:sz w:val="20"/>
+          <w:sz w:val="21"/>
         </w:rPr>
         <w:t>Developed an automated social media workflow using n8n and Airtable, supporting scheduled content verification and posting to 13+ platforms with OAuth2 authentication and token refreshing.</w:t>
       </w:r>
     </w:p>
     <w:p>
       <w:pPr>
+        <w:spacing w:before="120" w:after="40"/>
+        <w:pBdr>
+          <w:bottom w:val="single" w:sz="6" w:space="1" w:color="000000"/>
+        </w:pBdr>
+      </w:pPr>
+      <w:r>
+        <w:rPr>
+          <w:rFonts w:ascii="Times New Roman" w:hAnsi="Times New Roman"/>
+          <w:b w:val="0"/>
+          <w:sz w:val="21"/>
+        </w:rPr>
+        <w:t>PROJECTS</w:t>
+      </w:r>
+    </w:p>
+    <w:p>
+      <w:pPr>
         <w:spacing w:after="40"/>
         <w:tabs>
-          <w:tab w:val="right" w:pos="9360"/>
+          <w:tab w:val="right" w:pos="11520"/>
         </w:tabs>
       </w:pPr>
       <w:r>
         <w:rPr>
           <w:rFonts w:ascii="Times New Roman" w:hAnsi="Times New Roman"/>
           <w:b/>
-          <w:sz w:val="20"/>
+          <w:sz w:val="21"/>
         </w:rPr>
-        <w:t>Hospital Information Website:</w:t>
+        <w:t>Digital ALU:</w:t>
       </w:r>
       <w:r>
         <w:rPr>
           <w:rFonts w:ascii="Times New Roman" w:hAnsi="Times New Roman"/>
-          <w:i/>
-          <w:sz w:val="20"/>
+          <w:sz w:val="21"/>
         </w:rPr>
-        <w:t xml:space="preserve"> Backend development course</w:t>
+        <w:tab/>
+        <w:t>2024</w:t>
+      </w:r>
+    </w:p>
+    <w:p>
+      <w:pPr>
+        <w:pStyle w:val="ListBullet"/>
+        <w:spacing w:after="20"/>
+      </w:pPr>
+      <w:r>
+        <w:rPr>
+          <w:rFonts w:ascii="Times New Roman" w:hAnsi="Times New Roman"/>
+          <w:sz w:val="21"/>
+        </w:rPr>
+        <w:t>Designed and implemented both software and hardware version of a custom 3 signed-bit ALU supporting 4 modes: addition, subtraction, multiplication, and remainder division.</w:t>
+      </w:r>
+    </w:p>
+    <w:p>
+      <w:pPr>
+        <w:pStyle w:val="ListBullet"/>
+        <w:spacing w:after="20"/>
+      </w:pPr>
+      <w:r>
+        <w:rPr>
+          <w:rFonts w:ascii="Times New Roman" w:hAnsi="Times New Roman"/>
+          <w:sz w:val="21"/>
+        </w:rPr>
+        <w:t>Developed the ALU using Verilog HDL and rigorously tested it using ModelSim and testbenches.</w:t>
+      </w:r>
+    </w:p>
+    <w:p>
+      <w:pPr>
+        <w:pStyle w:val="ListBullet"/>
+        <w:spacing w:after="80"/>
+      </w:pPr>
+      <w:r>
+        <w:rPr>
+          <w:rFonts w:ascii="Times New Roman" w:hAnsi="Times New Roman"/>
+          <w:sz w:val="21"/>
+        </w:rPr>
+        <w:t>Designed hardware prototype using Logisim and transitioned the design to physically optimized implementation to reduce component count and resource usage to achieve maximum space and cost efficiency.</w:t>
+      </w:r>
+    </w:p>
+    <w:p>
+      <w:pPr>
+        <w:spacing w:after="40"/>
+        <w:tabs>
+          <w:tab w:val="right" w:pos="11520"/>
+        </w:tabs>
+      </w:pPr>
+      <w:r>
+        <w:rPr>
+          <w:rFonts w:ascii="Times New Roman" w:hAnsi="Times New Roman"/>
+          <w:b/>
+          <w:sz w:val="21"/>
+        </w:rPr>
+        <w:t>Automated Garbage Truck with Material Segregation:</w:t>
       </w:r>
       <w:r>
         <w:rPr>
           <w:rFonts w:ascii="Times New Roman" w:hAnsi="Times New Roman"/>
-          <w:sz w:val="20"/>
+          <w:sz w:val="21"/>
         </w:rPr>
         <w:tab/>
         <w:t>2025</w:t>
@@ -318,9 +466,9 @@
       <w:r>
         <w:rPr>
           <w:rFonts w:ascii="Times New Roman" w:hAnsi="Times New Roman"/>
-          <w:sz w:val="20"/>
+          <w:sz w:val="21"/>
         </w:rPr>
-        <w:t>Developed and implemented a scalable hospital management system using Node.js, Express and MongoDB Atlas, allowing ease of access for patients, doctors and admins.</w:t>
+        <w:t>Designed, built, and programmed a fully autonomous garbage-picking car using STM32 Blue pill MCU and ARM Assembly.</w:t>
       </w:r>
     </w:p>
     <w:p>
@@ -331,9 +479,9 @@
       <w:r>
         <w:rPr>
           <w:rFonts w:ascii="Times New Roman" w:hAnsi="Times New Roman"/>
-          <w:sz w:val="20"/>
+          <w:sz w:val="21"/>
         </w:rPr>
-        <w:t>Developed a secure authentication system using JWT and role-based access control for different user types, ensure privacy and secure access to sensitive information.</w:t>
+        <w:t>Implemented obstacle avoidance using servo-mounted sensors to scan surroundings, garbage detection and metal-nonmetal segregation using metal detectors, and bin-level detection with an embedded return-to-drop-site mechanism.</w:t>
       </w:r>
     </w:p>
     <w:p>
@@ -344,38 +492,93 @@
       <w:r>
         <w:rPr>
           <w:rFonts w:ascii="Times New Roman" w:hAnsi="Times New Roman"/>
-          <w:sz w:val="20"/>
+          <w:sz w:val="21"/>
         </w:rPr>
-        <w:t>Conducted unit and integration testing using Jest and Supertest to validate API functionality and system performance.</w:t>
+        <w:t>Led the team in hardware implementation and integration, CAD arm design, and optimized sizing and weight distribution, ensuring optimal performance.</w:t>
       </w:r>
     </w:p>
     <w:p>
       <w:pPr>
         <w:spacing w:after="40"/>
         <w:tabs>
-          <w:tab w:val="right" w:pos="9360"/>
+          <w:tab w:val="right" w:pos="11520"/>
         </w:tabs>
       </w:pPr>
       <w:r>
         <w:rPr>
           <w:rFonts w:ascii="Times New Roman" w:hAnsi="Times New Roman"/>
           <w:b/>
-          <w:sz w:val="20"/>
+          <w:sz w:val="21"/>
         </w:rPr>
-        <w:t>Google Docs Clone:</w:t>
+        <w:t>OS Scheduler and Memory Manager:</w:t>
       </w:r>
       <w:r>
         <w:rPr>
           <w:rFonts w:ascii="Times New Roman" w:hAnsi="Times New Roman"/>
-          <w:i/>
-          <w:sz w:val="20"/>
+          <w:sz w:val="21"/>
         </w:rPr>
-        <w:t xml:space="preserve"> Advanced programming techniques</w:t>
+        <w:tab/>
+        <w:t>2024</w:t>
+      </w:r>
+    </w:p>
+    <w:p>
+      <w:pPr>
+        <w:pStyle w:val="ListBullet"/>
+        <w:spacing w:after="20"/>
+      </w:pPr>
+      <w:r>
+        <w:rPr>
+          <w:rFonts w:ascii="Times New Roman" w:hAnsi="Times New Roman"/>
+          <w:sz w:val="21"/>
+        </w:rPr>
+        <w:t>Developed an OS-level scheduler in C on a Linux environment that selects among 4 implemented scheduling algorithms: SJF, Preemptive HPF, RR (with configurable quantum), Preemptive MLFQ.</w:t>
+      </w:r>
+    </w:p>
+    <w:p>
+      <w:pPr>
+        <w:pStyle w:val="ListBullet"/>
+        <w:spacing w:after="20"/>
+      </w:pPr>
+      <w:r>
+        <w:rPr>
+          <w:rFonts w:ascii="Times New Roman" w:hAnsi="Times New Roman"/>
+          <w:sz w:val="21"/>
+        </w:rPr>
+        <w:t>Engineered a process generator to simulate task arrivals and integrated intercross communication using message queues, signals, and shared memory, while employing forking to handle concurrent processes.</w:t>
+      </w:r>
+    </w:p>
+    <w:p>
+      <w:pPr>
+        <w:pStyle w:val="ListBullet"/>
+        <w:spacing w:after="80"/>
+      </w:pPr>
+      <w:r>
+        <w:rPr>
+          <w:rFonts w:ascii="Times New Roman" w:hAnsi="Times New Roman"/>
+          <w:sz w:val="21"/>
+        </w:rPr>
+        <w:t>Designed and implemented a Buddy Memory Allocation system using a tree structure with recursive splitting and merging for efficient dynamic memory management and minimized fragmentation.</w:t>
+      </w:r>
+    </w:p>
+    <w:p>
+      <w:pPr>
+        <w:spacing w:after="40"/>
+        <w:tabs>
+          <w:tab w:val="right" w:pos="11520"/>
+        </w:tabs>
+      </w:pPr>
+      <w:r>
+        <w:rPr>
+          <w:rFonts w:ascii="Times New Roman" w:hAnsi="Times New Roman"/>
+          <w:b/>
+          <w:sz w:val="21"/>
+        </w:rPr>
+        <w:t>Custom Programming Language Compiler:</w:t>
       </w:r>
       <w:r>
         <w:rPr>
           <w:rFonts w:ascii="Times New Roman" w:hAnsi="Times New Roman"/>
-          <w:sz w:val="20"/>
+          <w:sz w:val="21"/>
         </w:rPr>
         <w:tab/>
         <w:t>2025</w:t>
@@ -389,9 +592,9 @@
       <w:r>
         <w:rPr>
           <w:rFonts w:ascii="Times New Roman" w:hAnsi="Times New Roman"/>
-          <w:sz w:val="20"/>
+          <w:sz w:val="21"/>
         </w:rPr>
-        <w:t>Developed a real-time collaborative text editor in Java using Spring Boot, WebSockets, and JavaFX, supporting multi-user editing with role-based access.</w:t>
+        <w:t>Designed and implemented a full compiler front-end for a custom programming language using Flex and Bison in C.</w:t>
       </w:r>
     </w:p>
     <w:p>
@@ -402,9 +605,22 @@
       <w:r>
         <w:rPr>
           <w:rFonts w:ascii="Times New Roman" w:hAnsi="Times New Roman"/>
-          <w:sz w:val="20"/>
+          <w:sz w:val="21"/>
         </w:rPr>
-        <w:t>Implemented concurrent edits using a custom CRDT algorithm, multithreading, and asynchronous updates.</w:t>
+        <w:t>Built lexical analysis, parsing, AST construction, and semantic analysis supporting variables, functions, control flow, loops, scoping, and basic data types.</w:t>
+      </w:r>
+    </w:p>
+    <w:p>
+      <w:pPr>
+        <w:pStyle w:val="ListBullet"/>
+        <w:spacing w:after="20"/>
+      </w:pPr>
+      <w:r>
+        <w:rPr>
+          <w:rFonts w:ascii="Times New Roman" w:hAnsi="Times New Roman"/>
+          <w:sz w:val="21"/>
+        </w:rPr>
+        <w:t>Designed grammar rules, symbol table, and three-address code (TAC) intermediate representation.</w:t>
       </w:r>
     </w:p>
     <w:p>
@@ -415,38 +631,30 @@
       <w:r>
         <w:rPr>
           <w:rFonts w:ascii="Times New Roman" w:hAnsi="Times New Roman"/>
-          <w:sz w:val="20"/>
+          <w:sz w:val="21"/>
         </w:rPr>
-        <w:t>Integrated features like import/export files, user tracking with colored cursors using JavaFX, user comments, and graceful disconnection and reconnection.</w:t>
+        <w:t>Implemented semantic checks including type mismatch, undeclared/redeclared identifiers, and function parameter mismatch, and developed a GUI-based code editor for compilation and visualization.</w:t>
       </w:r>
     </w:p>
     <w:p>
       <w:pPr>
         <w:spacing w:after="40"/>
         <w:tabs>
-          <w:tab w:val="right" w:pos="9360"/>
+          <w:tab w:val="right" w:pos="11520"/>
         </w:tabs>
       </w:pPr>
       <w:r>
         <w:rPr>
           <w:rFonts w:ascii="Times New Roman" w:hAnsi="Times New Roman"/>
           <w:b/>
-          <w:sz w:val="20"/>
+          <w:sz w:val="21"/>
         </w:rPr>
-        <w:t>Fashion House Management System:</w:t>
+        <w:t>Alien vs Earth War simulation:</w:t>
       </w:r>
       <w:r>
         <w:rPr>
           <w:rFonts w:ascii="Times New Roman" w:hAnsi="Times New Roman"/>
-          <w:i/>
-          <w:sz w:val="20"/>
-        </w:rPr>
-        <w:t xml:space="preserve"> Databases</w:t>
-      </w:r>
-      <w:r>
-        <w:rPr>
-          <w:rFonts w:ascii="Times New Roman" w:hAnsi="Times New Roman"/>
-          <w:sz w:val="20"/>
+          <w:sz w:val="21"/>
         </w:rPr>
         <w:tab/>
         <w:t>2024</w:t>
@@ -460,9 +668,9 @@
       <w:r>
         <w:rPr>
           <w:rFonts w:ascii="Times New Roman" w:hAnsi="Times New Roman"/>
-          <w:sz w:val="20"/>
+          <w:sz w:val="21"/>
         </w:rPr>
-        <w:t>Designed and implemented a multi-user windows application using C# and .NET framework, implementing event-driven programming and interactive GUI.</w:t>
+        <w:t>Developed a simulation for a conflict between two armies using C++. Optimized for large-scale simulations.</w:t>
       </w:r>
     </w:p>
     <w:p>
@@ -473,9 +681,9 @@
       <w:r>
         <w:rPr>
           <w:rFonts w:ascii="Times New Roman" w:hAnsi="Times New Roman"/>
-          <w:sz w:val="20"/>
+          <w:sz w:val="21"/>
         </w:rPr>
-        <w:t>Engineered a secure SQL relational database in SQL Server Management studio, designing ER diagrams and optimizing table relationships for efficient data retrieval and improved application responsiveness.</w:t>
+        <w:t>Designed and implemented custom data structures for various army elements to efficiently manage different real-time operations such as insertion, deletion and updates.</w:t>
       </w:r>
     </w:p>
     <w:p>
@@ -486,169 +694,14 @@
       <w:r>
         <w:rPr>
           <w:rFonts w:ascii="Times New Roman" w:hAnsi="Times New Roman"/>
-          <w:sz w:val="20"/>
+          <w:sz w:val="21"/>
         </w:rPr>
-        <w:t>Developed secure authentication system with hashed passwords and encrypted payment details to ensure safe card storage and transaction processing.</w:t>
-      </w:r>
-    </w:p>
-    <w:p>
-      <w:pPr>
-        <w:spacing w:after="40"/>
-        <w:tabs>
-          <w:tab w:val="right" w:pos="9360"/>
-        </w:tabs>
-      </w:pPr>
-      <w:r>
-        <w:rPr>
-          <w:rFonts w:ascii="Times New Roman" w:hAnsi="Times New Roman"/>
-          <w:b/>
-          <w:sz w:val="20"/>
-        </w:rPr>
-        <w:t>Custom Programming Language Compiler:</w:t>
-      </w:r>
-      <w:r>
-        <w:rPr>
-          <w:rFonts w:ascii="Times New Roman" w:hAnsi="Times New Roman"/>
-          <w:i/>
-          <w:sz w:val="20"/>
-        </w:rPr>
-        <w:t xml:space="preserve"> Compilers</w:t>
-      </w:r>
-      <w:r>
-        <w:rPr>
-          <w:rFonts w:ascii="Times New Roman" w:hAnsi="Times New Roman"/>
-          <w:sz w:val="20"/>
-        </w:rPr>
-        <w:tab/>
-        <w:t>2025</w:t>
-      </w:r>
-    </w:p>
-    <w:p>
-      <w:pPr>
-        <w:pStyle w:val="ListBullet"/>
-        <w:spacing w:after="20"/>
-      </w:pPr>
-      <w:r>
-        <w:rPr>
-          <w:rFonts w:ascii="Times New Roman" w:hAnsi="Times New Roman"/>
-          <w:sz w:val="20"/>
-        </w:rPr>
-        <w:t>Designed and implemented a full compiler front-end for a custom programming language using Flex and Bison in C.</w:t>
-      </w:r>
-    </w:p>
-    <w:p>
-      <w:pPr>
-        <w:pStyle w:val="ListBullet"/>
-        <w:spacing w:after="20"/>
-      </w:pPr>
-      <w:r>
-        <w:rPr>
-          <w:rFonts w:ascii="Times New Roman" w:hAnsi="Times New Roman"/>
-          <w:sz w:val="20"/>
-        </w:rPr>
-        <w:t>Built lexical analysis, parsing, AST construction, and semantic analysis supporting variables, functions, control flow, loops, scoping, and basic data types.</w:t>
-      </w:r>
-    </w:p>
-    <w:p>
-      <w:pPr>
-        <w:pStyle w:val="ListBullet"/>
-        <w:spacing w:after="20"/>
-      </w:pPr>
-      <w:r>
-        <w:rPr>
-          <w:rFonts w:ascii="Times New Roman" w:hAnsi="Times New Roman"/>
-          <w:sz w:val="20"/>
-        </w:rPr>
-        <w:t>Designed grammar rules, symbol table, and three-address code (TAC) intermediate representation.</w:t>
-      </w:r>
-    </w:p>
-    <w:p>
-      <w:pPr>
-        <w:pStyle w:val="ListBullet"/>
-        <w:spacing w:after="80"/>
-      </w:pPr>
-      <w:r>
-        <w:rPr>
-          <w:rFonts w:ascii="Times New Roman" w:hAnsi="Times New Roman"/>
-          <w:sz w:val="20"/>
-        </w:rPr>
-        <w:t>Implemented semantic checks including type mismatch, undeclared/redeclared identifiers, and function parameter mismatch, and developed a GUI-based code editor for compilation and visualization.</w:t>
-      </w:r>
-    </w:p>
-    <w:p>
-      <w:pPr>
-        <w:spacing w:after="40"/>
-        <w:tabs>
-          <w:tab w:val="right" w:pos="9360"/>
-        </w:tabs>
-      </w:pPr>
-      <w:r>
-        <w:rPr>
-          <w:rFonts w:ascii="Times New Roman" w:hAnsi="Times New Roman"/>
-          <w:b/>
-          <w:sz w:val="20"/>
-        </w:rPr>
-        <w:t>OS Scheduler and Memory Manager:</w:t>
-      </w:r>
-      <w:r>
-        <w:rPr>
-          <w:rFonts w:ascii="Times New Roman" w:hAnsi="Times New Roman"/>
-          <w:i/>
-          <w:sz w:val="20"/>
-        </w:rPr>
-        <w:t xml:space="preserve"> Operating systems</w:t>
-      </w:r>
-      <w:r>
-        <w:rPr>
-          <w:rFonts w:ascii="Times New Roman" w:hAnsi="Times New Roman"/>
-          <w:sz w:val="20"/>
-        </w:rPr>
-        <w:tab/>
-        <w:t>2024</w:t>
-      </w:r>
-    </w:p>
-    <w:p>
-      <w:pPr>
-        <w:pStyle w:val="ListBullet"/>
-        <w:spacing w:after="20"/>
-      </w:pPr>
-      <w:r>
-        <w:rPr>
-          <w:rFonts w:ascii="Times New Roman" w:hAnsi="Times New Roman"/>
-          <w:sz w:val="20"/>
-        </w:rPr>
-        <w:t>Developed an OS-level scheduler in C on a Linux environment that selects among 4 implemented scheduling algorithms: SJF, Preemptive HPF, RR (with configurable quantum), Preemptive MLFQ.</w:t>
-      </w:r>
-    </w:p>
-    <w:p>
-      <w:pPr>
-        <w:pStyle w:val="ListBullet"/>
-        <w:spacing w:after="20"/>
-      </w:pPr>
-      <w:r>
-        <w:rPr>
-          <w:rFonts w:ascii="Times New Roman" w:hAnsi="Times New Roman"/>
-          <w:sz w:val="20"/>
-        </w:rPr>
-        <w:t>Engineered a process generator to simulate task arrivals and integrated intercross communication using message queues, signals, and shared memory, while employing forking to handle concurrent processes.</w:t>
-      </w:r>
-    </w:p>
-    <w:p>
-      <w:pPr>
-        <w:pStyle w:val="ListBullet"/>
-        <w:spacing w:after="80"/>
-      </w:pPr>
-      <w:r>
-        <w:rPr>
-          <w:rFonts w:ascii="Times New Roman" w:hAnsi="Times New Roman"/>
-          <w:sz w:val="20"/>
-        </w:rPr>
-        <w:t>Designed and implemented a Buddy Memory Allocation system using a tree structure with recursive splitting and merging for efficient dynamic memory management and minimized fragmentation.</w:t>
+        <w:t>Engineered multiple simulation modes driven by advanced algorithms to compute battle outcomes and generate comprehensive statistics on the battle results.</w:t>
       </w:r>
     </w:p>
     <w:sectPr>
       <w:pgSz w:w="12240" w:h="15840"/>
-      <w:pgMar w:top="720" w:right="1080" w:bottom="720" w:left="1080" w:header="720" w:footer="720" w:gutter="0"/>
+      <w:pgMar w:top="461" w:right="360" w:bottom="274" w:left="360" w:header="720" w:footer="720" w:gutter="0"/>
       <w:cols w:space="720"/>
       <w:docGrid w:linePitch="360"/>
     </w:sectPr>

</xml_diff>